<commit_message>
Store listing: website URLs, privacy fields in the store's page order
Privacy and support URLs now point to aisalesteam.app; the Privacy tab fields are listed
in the order the developer console shows them, with the three certifications; the two
questions the page no longer asks are removed. gen_cws_docx.py renders ### headings.

Co-Authored-By: Claude Opus 5.5 <noreply@anthropic.com>
</commit_message>
<xml_diff>
--- a/Chrome Web Store Listing.docx
+++ b/Chrome Web Store Listing.docx
@@ -202,7 +202,7 @@
     </w:p>
     <w:p>
       <w:r>
-        <w:t>SalesTeam only reads LinkedIn pages opened in your own browser (Posts/Jobs search, Company/People search, company and profile pages), stores everything locally in your browser, and never sends anything to a server we operate. See the full privacy policy at: https://claude.ai/artifact/F8o4GecGJnb1LD8VQJ3npG</w:t>
+        <w:t>SalesTeam only reads LinkedIn pages opened in your own browser (Posts/Jobs search, Company/People search, company and profile pages), stores everything locally in your browser, and never sends anything to a server we operate. See the full privacy policy at: https://aisalesteam.app/privacy.html</w:t>
       </w:r>
     </w:p>
     <w:p>
@@ -210,7 +210,15 @@
         <w:pStyle w:val="Heading2"/>
       </w:pPr>
       <w:r>
-        <w:t>Single purpose description (required field)</w:t>
+        <w:t>Privacy tab - fields in the order they appear on the page</w:t>
+      </w:r>
+    </w:p>
+    <w:p>
+      <w:pPr>
+        <w:pStyle w:val="Heading3"/>
+      </w:pPr>
+      <w:r>
+        <w:t>1. Single purpose description (required field)</w:t>
       </w:r>
     </w:p>
     <w:p>
@@ -220,10 +228,10 @@
     </w:p>
     <w:p>
       <w:pPr>
-        <w:pStyle w:val="Heading2"/>
+        <w:pStyle w:val="Heading3"/>
       </w:pPr>
       <w:r>
-        <w:t>Permission justifications (required field per permission)</w:t>
+        <w:t>2. Permission justifications (one field per permission)</w:t>
       </w:r>
     </w:p>
     <w:p>
@@ -231,7 +239,7 @@
         <w:rPr>
           <w:b/>
         </w:rPr>
-        <w:t>storage:</w:t>
+        <w:t>storage justification:</w:t>
       </w:r>
     </w:p>
     <w:p>
@@ -244,7 +252,20 @@
         <w:rPr>
           <w:b/>
         </w:rPr>
-        <w:t>sidePanel:</w:t>
+        <w:t>unlimitedStorage justification:</w:t>
+      </w:r>
+    </w:p>
+    <w:p>
+      <w:r>
+        <w:t>Lets the extension keep the data a user builds up - imported research workbooks (thousands of contacts and initiatives), searched leads and conversation history - in the browser's local storage without hitting Chrome's default 10 MB limit, after which saving new data would start to fail. Nothing is uploaded; the data stays on the user's device.</w:t>
+      </w:r>
+    </w:p>
+    <w:p>
+      <w:r>
+        <w:rPr>
+          <w:b/>
+        </w:rPr>
+        <w:t>sidePanel justification:</w:t>
       </w:r>
     </w:p>
     <w:p>
@@ -257,7 +278,7 @@
         <w:rPr>
           <w:b/>
         </w:rPr>
-        <w:t>clipboardWrite:</w:t>
+        <w:t>clipboardWrite justification:</w:t>
       </w:r>
     </w:p>
     <w:p>
@@ -270,7 +291,7 @@
         <w:rPr>
           <w:b/>
         </w:rPr>
-        <w:t>power:</w:t>
+        <w:t>power justification:</w:t>
       </w:r>
     </w:p>
     <w:p>
@@ -279,16 +300,11 @@
       </w:r>
     </w:p>
     <w:p>
+      <w:pPr>
+        <w:pStyle w:val="Heading3"/>
+      </w:pPr>
       <w:r>
-        <w:rPr>
-          <w:b/>
-        </w:rPr>
-        <w:t>unlimitedStorage:</w:t>
-      </w:r>
-    </w:p>
-    <w:p>
-      <w:r>
-        <w:t>Lets the extension keep the data a user builds up - imported research workbooks (thousands of contacts and initiatives), searched leads and conversation history - in the browser's local storage without hitting Chrome's default 10 MB limit, after which saving new data would start to fail. Nothing is uploaded; the data stays on the user's device.</w:t>
+        <w:t>3. Host permission justification (one field - paste both paragraphs)</w:t>
       </w:r>
     </w:p>
     <w:p>
@@ -319,10 +335,10 @@
     </w:p>
     <w:p>
       <w:pPr>
-        <w:pStyle w:val="Heading2"/>
+        <w:pStyle w:val="Heading3"/>
       </w:pPr>
       <w:r>
-        <w:t>Remote code question</w:t>
+        <w:t>4. Are you using remote code?</w:t>
       </w:r>
     </w:p>
     <w:p>
@@ -332,10 +348,10 @@
     </w:p>
     <w:p>
       <w:pPr>
-        <w:pStyle w:val="Heading2"/>
+        <w:pStyle w:val="Heading3"/>
       </w:pPr>
       <w:r>
-        <w:t>Data usage disclosure (Chrome's "Privacy practices" tab)</w:t>
+        <w:t>5. Data usage - what user data do you collect</w:t>
       </w:r>
     </w:p>
     <w:p>
@@ -353,10 +369,10 @@
     </w:p>
     <w:p>
       <w:pPr>
-        <w:pStyle w:val="ListBullet"/>
+        <w:pStyle w:val="Heading3"/>
       </w:pPr>
       <w:r>
-        <w:t>Is this data sold or used for purposes unrelated to the extension's function? No.</w:t>
+        <w:t>6. I certify that the following disclosures are true (tick all three)</w:t>
       </w:r>
     </w:p>
     <w:p>
@@ -364,7 +380,7 @@
         <w:pStyle w:val="ListBullet"/>
       </w:pPr>
       <w:r>
-        <w:t>Is this data used for advertising? No.</w:t>
+        <w:t>I do not sell or transfer user data to third parties, outside of the approved use cases</w:t>
       </w:r>
     </w:p>
     <w:p>
@@ -372,7 +388,31 @@
         <w:pStyle w:val="ListBullet"/>
       </w:pPr>
       <w:r>
-        <w:t>Privacy policy URL: https://claude.ai/artifact/F8o4GecGJnb1LD8VQJ3npG</w:t>
+        <w:t>I do not use or transfer user data for purposes that are unrelated to my item's single purpose</w:t>
+      </w:r>
+    </w:p>
+    <w:p>
+      <w:pPr>
+        <w:pStyle w:val="ListBullet"/>
+      </w:pPr>
+      <w:r>
+        <w:t>I do not use or transfer user data to determine creditworthiness or for lending purposes</w:t>
+      </w:r>
+    </w:p>
+    <w:p>
+      <w:pPr>
+        <w:pStyle w:val="Heading3"/>
+      </w:pPr>
+      <w:r>
+        <w:t>7. Privacy policy</w:t>
+      </w:r>
+    </w:p>
+    <w:p>
+      <w:pPr>
+        <w:pStyle w:val="ListBullet"/>
+      </w:pPr>
+      <w:r>
+        <w:t>Privacy policy URL: https://aisalesteam.app/privacy.html</w:t>
       </w:r>
     </w:p>
     <w:p>
@@ -385,12 +425,12 @@
     </w:p>
     <w:p>
       <w:r>
-        <w:t>https://claude.ai/artifact/MroEuwHoz9tbqAYoXWt3G5</w:t>
+        <w:t>https://aisalesteam.app/support.html</w:t>
       </w:r>
     </w:p>
     <w:p>
       <w:r>
-        <w:t>(Must be shared with "anyone with the link" from the page's Share menu, or reviewers and users can't open it.)</w:t>
+        <w:t>(Both pages are on the SalesTeam website, aisalesteam.app, and open for anyone.)</w:t>
       </w:r>
     </w:p>
     <w:p>

</xml_diff>

<commit_message>
Store listing docx regenerated from the 1.2.1 listing .md
Co-Authored-By: Claude Opus 5.5 <noreply@anthropic.com>
</commit_message>
<xml_diff>
--- a/Chrome Web Store Listing.docx
+++ b/Chrome Web Store Listing.docx
@@ -72,7 +72,7 @@
     </w:p>
     <w:p>
       <w:r>
-        <w:t>SalesTeam turns LinkedIn into a self-building, prioritized pipeline of target accounts, contacts, and leads - then gives you an AI sales team to act on it.</w:t>
+        <w:t>SalesTeam turns LinkedIn into a self-building, prioritized pipeline of target accounts, contacts, and leads (posts) - then gives you an AI sales team to act on it.</w:t>
       </w:r>
     </w:p>
     <w:p>
@@ -88,7 +88,15 @@
         <w:pStyle w:val="ListBullet"/>
       </w:pPr>
       <w:r>
-        <w:t>Target Account &amp; Contact Discovery: point it at your ideal customer profile (industry, size, location) and it builds your target company and contact universe automatically, with AI-driven prioritization rules - import a research spreadsheet, or let it discover companies and contacts on LinkedIn itself.</w:t>
+        <w:t>Guided setup that proposes its own answers: enter your company's website and SalesTeam reads it and proposes your locations, company sizes, industries, offer, ideal customer and target contacts - each shown next to the current setting, taken only if you choose it.</w:t>
+      </w:r>
+    </w:p>
+    <w:p>
+      <w:pPr>
+        <w:pStyle w:val="ListBullet"/>
+      </w:pPr>
+      <w:r>
+        <w:t>Target Account &amp; Contact Discovery: point it at your ideal customer profile (industry, size, location) and say how big the list should be, and it builds your target company and contact universe - finding matching companies in company listings on the public web, plus any you name yourself, with an estimate of cost and time up front. You can also import a research spreadsheet, or discover companies and contacts on LinkedIn.</w:t>
       </w:r>
     </w:p>
     <w:p>
@@ -120,7 +128,7 @@
         <w:pStyle w:val="ListBullet"/>
       </w:pPr>
       <w:r>
-        <w:t>Results are merged, deduplicated, and ranked, with matched keywords, hiring/freelance signals, and connection-degree shown on every lead.</w:t>
+        <w:t>Results are merged, deduplicated, and ranked, with matched keywords, hiring/freelance signals, and connection-degree shown on every lead (post).</w:t>
       </w:r>
     </w:p>
     <w:p>
@@ -128,7 +136,7 @@
         <w:pStyle w:val="ListBullet"/>
       </w:pPr>
       <w:r>
-        <w:t>A Dashboard tab turns the results into a real pipeline view: pie charts by status, a sortable/filterable table, per-lead detail pages, CSV export, and safe bulk status changes (confirmation required, one level of undo). A Target Accounts Explorer does the same for your company/contact universe - priority, evidence level, and contact coverage at a glance.</w:t>
+        <w:t>The Leads Dashboard turns the leads (posts) into a real pipeline view: pie charts by status, a sortable/filterable table, per-lead detail pages, CSV export, every active filter shown above the table with one-click clear, and safe bulk status changes (confirmation required, one level of undo). A Target Accounts Explorer does the same for your company/contact universe - priority, evidence level, and contact coverage at a glance, with accounts and contacts each exportable as a spreadsheet that opens in Excel, or as HubSpot import files.</w:t>
       </w:r>
     </w:p>
     <w:p>
@@ -136,7 +144,7 @@
         <w:pStyle w:val="ListBullet"/>
       </w:pPr>
       <w:r>
-        <w:t>Built for personal use, the way a person would use these sites: your research draws on publicly available sources (company registries and websites, through the research prompt) and on platforms such as LinkedIn. Every scan starts when you click a button. Automatic account preparation runs only if you switch it on: You start it once; SalesTeam keeps your accounts ready within your daily LinkedIn limit, visible in your browser, and you can turn it off at any time. Every search and page visit happens in a browser tab or window you can see, only while your browser is open. There is no bulk page collection, and a built-in daily limit keeps searches and page visits modest. SalesTeam has no server or database of its own, never resells or shares data, and never sends messages for you.</w:t>
+        <w:t>Built for personal use, the way a person would use these sites: your research draws on publicly available sources (company registries and websites, through the research prompt or SalesTeam's own web research on your Anthropic API key) and on platforms such as LinkedIn. Every scan starts when you click a button. Automatic account preparation runs only if you switch it on: You start it once; SalesTeam keeps your accounts ready within your daily LinkedIn limit, visible in your browser, and you can turn it off at any time. Every search and page visit happens in a browser tab or window you can see, only while your browser is open. There is no bulk page collection, and a built-in daily limit keeps searches and page visits modest. SalesTeam has no server or database of its own, never resells or shares data, and never sends messages for you.</w:t>
       </w:r>
     </w:p>
     <w:p>
@@ -152,7 +160,7 @@
         <w:pStyle w:val="ListBullet"/>
       </w:pPr>
       <w:r>
-        <w:t>Automatic prioritization: after every scan, each new lead is scored 1 (highest) to 5 (lowest) by real fit and urgency - not just keyword overlap - so you always know what to work on first. Target companies get their own AI-judged Strategic Fit score the same way.</w:t>
+        <w:t>Automatic prioritization: after every scan, each new lead (post) is scored 1 (highest) to 5 (lowest) by real fit and urgency - not just keyword overlap - so you always know what to work on first. Target companies get their own AI-judged Strategic Fit score the same way.</w:t>
       </w:r>
     </w:p>
     <w:p>
@@ -160,7 +168,7 @@
         <w:pStyle w:val="ListBullet"/>
       </w:pPr>
       <w:r>
-        <w:t>AI-drafted opening messages for any lead - editable, and only ever copied for you to paste and send yourself. Nothing is auto-sent.</w:t>
+        <w:t>AI-drafted opening messages for any lead (post) - editable, and only ever copied for you to paste and send yourself. Nothing is auto-sent.</w:t>
       </w:r>
     </w:p>
     <w:p>
@@ -223,7 +231,7 @@
     </w:p>
     <w:p>
       <w:r>
-        <w:t>Searches LinkedIn's Posts, Jobs, Company, and People search results, plus individual company and profile pages, to build a target-account/contact universe and surface B2B sales leads, using the same logged-in LinkedIn session the user would browse with manually — no separate credentials or automation account. Also offers optional AI-assisted analysis, prioritization, and message drafting using the user's own Anthropic API key.</w:t>
+        <w:t>Searches LinkedIn's Posts, Jobs, Company, and People search results, plus individual company and profile pages, to build a target-account/contact universe and surface B2B sales leads (posts), using the same logged-in LinkedIn session the user would browse with manually — no separate credentials or automation account. Also offers optional AI-assisted analysis, prioritization, and message drafting using the user's own Anthropic API key.</w:t>
       </w:r>
     </w:p>
     <w:p>
@@ -257,7 +265,7 @@
     </w:p>
     <w:p>
       <w:r>
-        <w:t>Lets the extension keep the data a user builds up - imported research workbooks (thousands of contacts and initiatives), searched leads and conversation history - in the browser's local storage without hitting Chrome's default 10 MB limit, after which saving new data would start to fail. Nothing is uploaded; the data stays on the user's device.</w:t>
+        <w:t>Lets the extension keep the data a user builds up - imported research workbooks (thousands of contacts and initiatives), searched leads (posts) and conversation history - in the browser's local storage without hitting Chrome's default 10 MB limit, after which saving new data would start to fail. Nothing is uploaded; the data stays on the user's device.</w:t>
       </w:r>
     </w:p>
     <w:p>
@@ -317,7 +325,7 @@
     </w:p>
     <w:p>
       <w:r>
-        <w:t>Required to read the Posts, Jobs, Company Search, People Search, individual company, and individual profile pages the user is already viewing (or that a user-triggered search, or the automatic account preparation the user has switched on, opens in a tab or a small window of its own), in order to match leads and build/enrich the user's target-account and target-contact lists. The extension does not run on any other website.</w:t>
+        <w:t>Required to read the Posts, Jobs, Company Search, People Search, individual company, and individual profile pages the user is already viewing (or that a user-triggered search, or the automatic account preparation the user has switched on, opens in a tab or a small window of its own), in order to match leads (posts) and build/enrich the user's target-account and target-contact lists. The extension does not run on any other website.</w:t>
       </w:r>
     </w:p>
     <w:p>
@@ -364,7 +372,7 @@
     </w:p>
     <w:p>
       <w:r>
-        <w:t>Does this extension collect or transmit user data (Personal Identifiable Information) ? Yes - lead and target-account text and chat content, only when the optional AI features are used, sent directly to Anthropic's API using the user's own key.</w:t>
+        <w:t>Does this extension collect or transmit user data (Personal Identifiable Information) ? Yes - lead (post) and target-account text and chat content, only when the optional AI features are used, sent directly to Anthropic's API using the user's own key.</w:t>
       </w:r>
     </w:p>
     <w:p>

</xml_diff>

<commit_message>
1.2.2 team use: step 7 - Help, privacy, listing, release notes, PRD; table-only scrolling
- Help: new Team section (10 entries); LinkedIn/data answer mentions the team folder
- Store listing: team bullet, privacy text, alarms justification, badge in host
  justification, "Leads dashboards"
- Release notes 1.2.2; PRD 6.23 Team use, non-goal and section 7/8 updated
- Settings > Team join warning: own accounts are offered to tick
- Leads, Target Accounts, Target Contacts: only the table scrolls, header row
  sticky; page no longer scrolls as a whole under the top status bar
- Removed the step-0 probe (team-folder-probe.js, TEAM_SPIKE_SW_PROBE)
- Version 1.2.2

Co-Authored-By: Claude Opus 5.5 <noreply@anthropic.com>
</commit_message>
<xml_diff>
--- a/Chrome Web Store Listing.docx
+++ b/Chrome Web Store Listing.docx
@@ -144,7 +144,15 @@
         <w:pStyle w:val="ListBullet"/>
       </w:pPr>
       <w:r>
-        <w:t>Built for personal use, the way a person would use these sites: your research draws on publicly available sources (company registries and websites, through the research prompt or SalesTeam's own web research on your Anthropic API key) and on platforms such as LinkedIn. Every scan starts when you click a button. Automatic account preparation runs only if you switch it on: You start it once; SalesTeam keeps your accounts ready within your daily LinkedIn limit, visible in your browser, and you can turn it off at any time. Every search and page visit happens in a browser tab or window you can see, only while your browser is open. There is no bulk page collection, and a built-in daily limit keeps searches and page visits modest. SalesTeam has no server or database of its own, never resells or shares data, and never sends messages for you.</w:t>
+        <w:t>Work as a team: colleagues share one set of accounts, contacts and leads (posts) through a OneDrive folder your team owns - changes reach everyone by themselves. "Assign to me" keeps an account yours so nobody else works it, the Team Admin owns the Setup and can reassign accounts, and a small badge on LinkedIn company and profile pages shows who has the account. Each member scans with their own LinkedIn account and their own daily limit; API keys, drafts and scanner settings stay personal. No SalesTeam server and no sign-in.</w:t>
+      </w:r>
+    </w:p>
+    <w:p>
+      <w:pPr>
+        <w:pStyle w:val="ListBullet"/>
+      </w:pPr>
+      <w:r>
+        <w:t>Built for personal use, the way a person would use these sites: your research draws on publicly available sources (company registries and websites, through the research prompt or SalesTeam's own web research on your Anthropic API key) and on platforms such as LinkedIn. Every scan starts when you click a button. Automatic account preparation runs only if you switch it on: You start it once; SalesTeam keeps your accounts ready within your daily LinkedIn limit, visible in your browser, and you can turn it off at any time. Every search and page visit happens in a browser tab or window you can see, only while your browser is open. There is no bulk page collection, and a built-in daily limit keeps searches and page visits modest. SalesTeam has no server or database of its own, never resells or shares data, and never sends messages for you. In a team, the shared data lives only in your team's own OneDrive folder.</w:t>
       </w:r>
     </w:p>
     <w:p>
@@ -210,7 +218,7 @@
     </w:p>
     <w:p>
       <w:r>
-        <w:t>SalesTeam only reads LinkedIn pages opened in your own browser (Posts/Jobs search, Company/People search, company and profile pages), stores everything locally in your browser, and never sends anything to a server we operate. See the full privacy policy at: https://aisalesteam.app/privacy.html</w:t>
+        <w:t>SalesTeam only reads LinkedIn pages opened in your own browser (Posts/Jobs search, Company/People search, company and profile pages), stores everything locally in your browser - and, if you work as a team, in a OneDrive folder your team owns and shares - and never sends anything to a server we operate. See the full privacy policy at: https://aisalesteam.app/privacy.html</w:t>
       </w:r>
     </w:p>
     <w:p>
@@ -278,7 +286,7 @@
     </w:p>
     <w:p>
       <w:r>
-        <w:t>Displays quick links to open the Scanner, Target Accounts, Target Contacts and Posts dashboards, plus pipeline stats.</w:t>
+        <w:t>Displays quick links to open the Scanner, Target Accounts, Target Contacts and Leads dashboards, plus pipeline stats.</w:t>
       </w:r>
     </w:p>
     <w:p>
@@ -292,6 +300,19 @@
     <w:p>
       <w:r>
         <w:t>Lets the user copy an AI-drafted message with one click, to paste into LinkedIn's own message compose box.</w:t>
+      </w:r>
+    </w:p>
+    <w:p>
+      <w:r>
+        <w:rPr>
+          <w:b/>
+        </w:rPr>
+        <w:t>alarms justification:</w:t>
+      </w:r>
+    </w:p>
+    <w:p>
+      <w:r>
+        <w:t>Only for team use: for a member of a team, wakes SalesTeam's background every half minute while Chrome runs, to write the member's changes to the team's shared OneDrive folder, read colleagues' changes from it, and mark the member as online. Without a team nothing is scheduled. It never starts a LinkedIn scan or visit.</w:t>
       </w:r>
     </w:p>
     <w:p>
@@ -325,7 +346,7 @@
     </w:p>
     <w:p>
       <w:r>
-        <w:t>Required to read the Posts, Jobs, Company Search, People Search, individual company, and individual profile pages the user is already viewing (or that a user-triggered search, or the automatic account preparation the user has switched on, opens in a tab or a small window of its own), in order to match leads (posts) and build/enrich the user's target-account and target-contact lists. The extension does not run on any other website.</w:t>
+        <w:t>Required to read the Posts, Jobs, Company Search, People Search, individual company, and individual profile pages the user is already viewing (or that a user-triggered search, or the automatic account preparation the user has switched on, opens in a tab or a small window of its own), in order to match leads (posts) and build/enrich the user's target-account and target-contact lists. For team users, it also shows a small badge on LinkedIn company and profile pages saying which team member that account is assigned to; it reads only the page address for this. The extension does not run on any other website.</w:t>
       </w:r>
     </w:p>
     <w:p>
@@ -372,7 +393,7 @@
     </w:p>
     <w:p>
       <w:r>
-        <w:t>Does this extension collect or transmit user data (Personal Identifiable Information) ? Yes - lead (post) and target-account text and chat content, only when the optional AI features are used, sent directly to Anthropic's API using the user's own key.</w:t>
+        <w:t>Does this extension collect or transmit user data (Personal Identifiable Information) ? Yes - lead (post) and target-account text and chat content, only when the optional AI features are used, sent directly to Anthropic's API using the user's own key. (Team use writes shared data only into a OneDrive folder on the user's own computer that the user's team owns; the extension sends it to no server.)</w:t>
       </w:r>
     </w:p>
     <w:p>

</xml_diff>

<commit_message>
1.2.3 Team advanced mode step 6: Help, PRD, release notes, listing; Take over as Team Lead
- Help: account groups, seeing only some accounts, an account moving to
  another group, which accounts are researched; Team Lead and Assign entries
- PRD 6.26 Team advanced mode (with gen_docs.py mirror), release notes 1.2.3
- Store listing: Team Lead, groups, Salesforce and Microsoft Dynamics
- Take over as Team Lead (D13): offered in Settings > Team once the Team Lead
  has not been seen for 30 days - the deputy, or any member without a deputy
- "My pipeline researches": "can work on right now"

Co-Authored-By: Claude Opus 5.5 <noreply@anthropic.com>
</commit_message>
<xml_diff>
--- a/Chrome Web Store Listing.docx
+++ b/Chrome Web Store Listing.docx
@@ -136,7 +136,7 @@
         <w:pStyle w:val="ListBullet"/>
       </w:pPr>
       <w:r>
-        <w:t>The Leads Dashboard turns the leads (posts) into a real pipeline view: pie charts by status, a sortable/filterable table, per-lead detail pages, CSV export, every active filter shown above the table with one-click clear, and safe bulk status changes (confirmation required, one level of undo). A Target Accounts Explorer does the same for your company/contact universe - priority, evidence level, and contact coverage at a glance, with accounts and contacts each exportable as a spreadsheet that opens in Excel, or as HubSpot import files.</w:t>
+        <w:t>The Leads Dashboard turns the leads (posts) into a real pipeline view: pie charts by status, a sortable/filterable table, per-lead detail pages, CSV export, every active filter shown above the table with one-click clear, and safe bulk status changes (confirmation required, one level of undo). A Target Accounts Explorer does the same for your company/contact universe - priority, evidence level, and contact coverage at a glance, with accounts and contacts each exportable as a spreadsheet that opens in Excel, or as files for HubSpot, Salesforce and Microsoft Dynamics.</w:t>
       </w:r>
     </w:p>
     <w:p>
@@ -144,7 +144,7 @@
         <w:pStyle w:val="ListBullet"/>
       </w:pPr>
       <w:r>
-        <w:t>Work as a team: colleagues share one set of accounts, contacts and leads (posts) through a OneDrive folder your team owns - changes reach everyone by themselves. "Assign to me" keeps an account yours so nobody else works it, the Team Admin owns the Setup and can reassign accounts, and a small badge on LinkedIn company and profile pages shows who has the account. Each member scans with their own LinkedIn account and their own daily limit; API keys, drafts and scanner settings stay personal. No SalesTeam server and no sign-in.</w:t>
+        <w:t>Work as a team: colleagues share one set of accounts, contacts and leads (posts) through a OneDrive folder your team owns - changes reach everyone by themselves. "Assign to me" keeps an account yours so nobody else works it, the Team Lead owns the Setup, can reassign accounts and can split the accounts into groups so that each member sees and works their own part of the list, and a small badge on LinkedIn company and profile pages shows who has the account. Each member scans with their own LinkedIn account and their own daily limit; API keys, drafts and scanner settings stay personal. No SalesTeam server and no sign-in.</w:t>
       </w:r>
     </w:p>
     <w:p>

</xml_diff>

<commit_message>
Store listing: no CRM brand names in the description (1.2.3 rejected for keyword spam)
The Chrome Web Store flagged "HubSpot, Salesforce and Microsoft Dynamics" in
the Detailed description. It now says "import files for common CRM systems";
two repeated "daily LinkedIn limit" became "daily limit".

Co-Authored-By: Claude Opus 5.5 <noreply@anthropic.com>
</commit_message>
<xml_diff>
--- a/Chrome Web Store Listing.docx
+++ b/Chrome Web Store Listing.docx
@@ -104,7 +104,7 @@
         <w:pStyle w:val="ListBullet"/>
       </w:pPr>
       <w:r>
-        <w:t>Accounts kept ready automatically: switch it on once and SalesTeam links your accounts to their LinkedIn pages, finds their size and their key contacts, and shows how many are ready to work - within your daily LinkedIn limit, in a small window of its own, making way whenever you start a scan. What it cannot settle by itself waits for you in one Decisions list. Turn it off at any time in Settings &gt; Automation.</w:t>
+        <w:t>Accounts kept ready automatically: switch it on once and SalesTeam links your accounts to their LinkedIn pages, finds their size and their key contacts, and shows how many are ready to work - within your daily limit, in a small window of its own, making way whenever you start a scan. What it cannot settle by itself waits for you in one Decisions list. Turn it off at any time in Settings &gt; Automation.</w:t>
       </w:r>
     </w:p>
     <w:p>
@@ -136,7 +136,7 @@
         <w:pStyle w:val="ListBullet"/>
       </w:pPr>
       <w:r>
-        <w:t>The Leads Dashboard turns the leads (posts) into a real pipeline view: pie charts by status, a sortable/filterable table, per-lead detail pages, CSV export, every active filter shown above the table with one-click clear, and safe bulk status changes (confirmation required, one level of undo). A Target Accounts Explorer does the same for your company/contact universe - priority, evidence level, and contact coverage at a glance, with accounts and contacts each exportable as a spreadsheet that opens in Excel, or as files for HubSpot, Salesforce and Microsoft Dynamics.</w:t>
+        <w:t>The Leads Dashboard turns the leads (posts) into a real pipeline view: pie charts by status, a sortable/filterable table, per-lead detail pages, CSV export, every active filter shown above the table with one-click clear, and safe bulk status changes (confirmation required, one level of undo). A Target Accounts Explorer does the same for your company/contact universe - priority, evidence level, and contact coverage at a glance, with accounts and contacts each exportable as a spreadsheet that opens in Excel, or as import files for common CRM systems.</w:t>
       </w:r>
     </w:p>
     <w:p>
@@ -152,7 +152,7 @@
         <w:pStyle w:val="ListBullet"/>
       </w:pPr>
       <w:r>
-        <w:t>Built for personal use, the way a person would use these sites: your research draws on publicly available sources (company registries and websites, through the research prompt or SalesTeam's own web research on your Anthropic API key) and on platforms such as LinkedIn. Every scan starts when you click a button. Automatic account preparation runs only if you switch it on: You start it once; SalesTeam keeps your accounts ready within your daily LinkedIn limit, visible in your browser, and you can turn it off at any time. Every search and page visit happens in a browser tab or window you can see, only while your browser is open. There is no bulk page collection, and a built-in daily limit keeps searches and page visits modest. SalesTeam has no server or database of its own, never resells or shares data, and never sends messages for you. In a team, the shared data lives only in your team's own OneDrive folder.</w:t>
+        <w:t>Built for personal use, the way a person would use these sites: your research draws on publicly available sources (company registries and websites, through the research prompt or SalesTeam's own web research on your Anthropic API key) and on platforms such as LinkedIn. Every scan starts when you click a button. Automatic account preparation runs only if you switch it on: You start it once; SalesTeam keeps your accounts ready within your daily limit, visible in your browser, and you can turn it off at any time. Every search and page visit happens in a browser tab or window you can see, only while your browser is open. There is no bulk page collection, and a built-in daily limit keeps searches and page visits modest. SalesTeam has no server or database of its own, never resells or shares data, and never sends messages for you. In a team, the shared data lives only in your team's own OneDrive folder.</w:t>
       </w:r>
     </w:p>
     <w:p>

</xml_diff>

<commit_message>
1.2.4 Notes step 7: Help, PRD, release notes, listing
- Help: three entries (writing notes; notes in a team; the Sales Mentor and
  drafts read the notes, and when notes are sent to the AI service), a
  sentence in the two team entries, and the Salesforce entry (notes in
  Description; the short import only adds new accounts).
- PRD 6.27 Notes on accounts, contacts and leads; version 1.2.4.
- Release notes v1.2.4: Notes; Microsoft Edge wording and smaller
  improvements (builds 1.2.3.1-1.2.3.9, 1.2.3.17).
- Store listing: a Notes bullet; the data-use answer names the notes.

Co-Authored-By: Claude Opus 5.5 <noreply@anthropic.com>
</commit_message>
<xml_diff>
--- a/Chrome Web Store Listing.docx
+++ b/Chrome Web Store Listing.docx
@@ -137,6 +137,14 @@
       </w:pPr>
       <w:r>
         <w:t>The Leads Dashboard turns the leads (posts) into a real pipeline view: pie charts by status, a sortable/filterable table, per-lead detail pages, CSV export, every active filter shown above the table with one-click clear, and safe bulk status changes (confirmation required, one level of undo). A Target Accounts Explorer does the same for your company/contact universe - priority, evidence level, and contact coverage at a glance, with accounts and contacts each exportable as a spreadsheet that opens in Excel, or as import files for common CRM systems.</w:t>
+      </w:r>
+    </w:p>
+    <w:p>
+      <w:pPr>
+        <w:pStyle w:val="ListBullet"/>
+      </w:pPr>
+      <w:r>
+        <w:t>Notes on accounts, contacts and leads (posts): write down what you did and what you learned - SalesTeam adds the date and your name. Each account shows one timeline with the notes on its contacts and leads, a "Last note" column shows where something happened last, and in a team everyone who sees an account sees its notes.</w:t>
       </w:r>
     </w:p>
     <w:p>
@@ -393,7 +401,7 @@
     </w:p>
     <w:p>
       <w:r>
-        <w:t>Does this extension collect or transmit user data (Personal Identifiable Information) ? Yes - lead (post) and target-account text and chat content, only when the optional AI features are used, sent directly to Anthropic's API using the user's own key. (Team use writes shared data only into a OneDrive folder on the user's own computer that the user's team owns; the extension sends it to no server.)</w:t>
+        <w:t>Does this extension collect or transmit user data (Personal Identifiable Information) ? Yes - lead (post) and target-account text, the notes the user wrote on them, and chat content, only when the optional AI features are used, sent directly to Anthropic's API using the user's own key. (Team use writes shared data only into a OneDrive folder on the user's own computer that the user's team owns; the extension sends it to no server.)</w:t>
       </w:r>
     </w:p>
     <w:p>

</xml_diff>

<commit_message>
Store listing: the nine data-usage checkboxes with YES or NO (Chrome and Edge)
Co-Authored-By: Claude Opus 5.5 <noreply@anthropic.com>
</commit_message>
<xml_diff>
--- a/Chrome Web Store Listing.docx
+++ b/Chrome Web Store Listing.docx
@@ -401,6 +401,56 @@
     </w:p>
     <w:p>
       <w:r>
+        <w:t>The nine checkboxes, in the order they appear (the same answers in the Chrome Web Store and in Microsoft Edge Add-ons, Partner Center, "What user data do you plan to collect"):</w:t>
+      </w:r>
+    </w:p>
+    <w:p>
+      <w:r>
+        <w:t>1. Personally identifiable information - YES. Names and job titles of contacts and post authors.</w:t>
+      </w:r>
+    </w:p>
+    <w:p>
+      <w:r>
+        <w:t>2. Health information - NO.</w:t>
+      </w:r>
+    </w:p>
+    <w:p>
+      <w:r>
+        <w:t>3. Financial and payment information - NO.</w:t>
+      </w:r>
+    </w:p>
+    <w:p>
+      <w:r>
+        <w:t>4. Authentication information - YES. The user's own Anthropic API key is stored in the browser.</w:t>
+      </w:r>
+    </w:p>
+    <w:p>
+      <w:r>
+        <w:t>5. Personal communications - NO. SalesTeam drafts messages but does not read the user's emails, chats or LinkedIn inbox.</w:t>
+      </w:r>
+    </w:p>
+    <w:p>
+      <w:r>
+        <w:t>6. Location - NO.</w:t>
+      </w:r>
+    </w:p>
+    <w:p>
+      <w:r>
+        <w:t>7. Web history - NO. It does not record which pages the user visits.</w:t>
+      </w:r>
+    </w:p>
+    <w:p>
+      <w:r>
+        <w:t>8. User activity - NO. It does not log clicks, keystrokes or network traffic. (Its Activity Log records what was done inside SalesTeam, which is not what this box means.)</w:t>
+      </w:r>
+    </w:p>
+    <w:p>
+      <w:r>
+        <w:t>9. Website content - YES. Text of LinkedIn posts, company and profile pages that SalesTeam reads.</w:t>
+      </w:r>
+    </w:p>
+    <w:p>
+      <w:r>
         <w:t>Does this extension collect or transmit user data (Personal Identifiable Information) ? Yes - lead (post) and target-account text, the notes the user wrote on them, and chat content, only when the optional AI features are used, sent directly to Anthropic's API using the user's own key. (Team use writes shared data only into a OneDrive folder on the user's own computer that the user's team owns; the extension sends it to no server.)</w:t>
       </w:r>
     </w:p>

</xml_diff>

<commit_message>
1.2.4.6 docs and store release: temporary research measurement tool removed; Help "What are projects and adoption stages?"; PRD 6.29 (projects, generic field names, SalesTeam Excel export, research follows the seller's offer, measurement) + initiative->project in 6.21-6.27; release notes v1.2.4.6; both store listings say projects
Co-Authored-By: Claude Opus 5.5 <noreply@anthropic.com>
</commit_message>
<xml_diff>
--- a/Chrome Web Store Listing.docx
+++ b/Chrome Web Store Listing.docx
@@ -208,7 +208,7 @@
         <w:pStyle w:val="ListBullet"/>
       </w:pPr>
       <w:r>
-        <w:t>Web research: researches your accounts on the public web, with sources you can open and check. Click to research an account, or let account preparation do it within a monthly budget you set, never above it.</w:t>
+        <w:t>Web research: researches your accounts on the public web - size, headquarters and recent projects where what you sell could help - with sources you can open and check. Click to research an account, or let account preparation do it within a monthly budget you set, never above it.</w:t>
       </w:r>
     </w:p>
     <w:p>
@@ -281,7 +281,7 @@
     </w:p>
     <w:p>
       <w:r>
-        <w:t>Lets the extension keep the data a user builds up - imported research workbooks (thousands of contacts and initiatives), searched leads (posts) and conversation history - in the browser's local storage without hitting Chrome's default 10 MB limit, after which saving new data would start to fail. Nothing is uploaded; the data stays on the user's device.</w:t>
+        <w:t>Lets the extension keep the data a user builds up - imported research workbooks (thousands of contacts and projects), searched leads (posts) and conversation history - in the browser's local storage without hitting Chrome's default 10 MB limit, after which saving new data would start to fail. Nothing is uploaded; the data stays on the user's device.</w:t>
       </w:r>
     </w:p>
     <w:p>

</xml_diff>

<commit_message>
Store listings for 1.2.4.35: data protection, Leads bulk edit, privacy sentence (Chrome and Edge)
Detailed description: a Data protection bullet (lead retention, Delete permanently, a person's request with PDF,
do-not-store, reasons, exportable 12-month Activity Log), the Leads bulk change reworded for the tick boxes, and one
sentence in the Privacy paragraph. Privacy tab unchanged (same permissions and data types).

Co-Authored-By: Claude Opus 5.5 <noreply@anthropic.com>
</commit_message>
<xml_diff>
--- a/Chrome Web Store Listing.docx
+++ b/Chrome Web Store Listing.docx
@@ -136,7 +136,7 @@
         <w:pStyle w:val="ListBullet"/>
       </w:pPr>
       <w:r>
-        <w:t>The Leads Dashboard turns the leads (posts) into a real pipeline view: pie charts by status, a sortable/filterable table, per-lead detail pages, CSV export, every active filter shown above the table with one-click clear, and safe bulk status changes (confirmation required, one level of undo). A Target Accounts Explorer does the same for your company/contact universe - priority, evidence level, and contact coverage at a glance, with accounts and contacts each exportable as a spreadsheet that opens in Excel, or as import files for common CRM systems.</w:t>
+        <w:t>The Leads Dashboard turns the leads (posts) into a real pipeline view: pie charts by status, a sortable/filterable table, per-lead detail pages, CSV export, every active filter shown above the table with one-click clear, and tick leads to change their status in bulk (confirmation required, one level of undo). A Target Accounts Explorer does the same for your company/contact universe - priority, evidence level, and contact coverage at a glance, with accounts and contacts each exportable as a spreadsheet that opens in Excel, or as import files for common CRM systems.</w:t>
       </w:r>
     </w:p>
     <w:p>
@@ -145,6 +145,14 @@
       </w:pPr>
       <w:r>
         <w:t>Notes on accounts, contacts and leads (posts): write down what you did and what you learned - SalesTeam adds the date and your name. Each account shows one timeline with the notes on its contacts and leads, a "Last note" column shows where something happened last, and in a team everyone who sees an account sees its notes.</w:t>
+      </w:r>
+    </w:p>
+    <w:p>
+      <w:pPr>
+        <w:pStyle w:val="ListBullet"/>
+      </w:pPr>
+      <w:r>
+        <w:t>Data protection built in: choose how long leads are kept (deleted automatically after 6, 12 or 24 months), delete a contact or lead permanently, and answer a person's request in one place - find everything SalesTeam holds about them, save it as a PDF, or erase it and keep them from being stored again. Removals, merges and deletions ask for a reason, and the Activity Log (kept 12 months) can be exported for audits.</w:t>
       </w:r>
     </w:p>
     <w:p>
@@ -226,7 +234,7 @@
     </w:p>
     <w:p>
       <w:r>
-        <w:t>SalesTeam only reads LinkedIn pages opened in your own browser (Posts/Jobs search, Company/People search, company and profile pages), stores everything locally in your browser - and, if you work as a team, in a OneDrive folder your team owns and shares - and never sends anything to a server we operate. See the full privacy policy at: https://aisalesteam.app/privacy.html</w:t>
+        <w:t>SalesTeam only reads LinkedIn pages opened in your own browser (Posts/Jobs search, Company/People search, company and profile pages), stores everything locally in your browser - and, if you work as a team, in a OneDrive folder your team owns and shares - and never sends anything to a server we operate. You decide how long leads are kept, and can delete anyone's data permanently from Settings &gt; Data protection. See the full privacy policy at: https://aisalesteam.app/privacy.html</w:t>
       </w:r>
     </w:p>
     <w:p>

</xml_diff>